<commit_message>
Remove o limite de paginas e padroniza o template de entrega
- Sai a regra de 5 slides ou 2 paginas do enunciado, do template, do guia de
  tipo de case e do framework. O que padroniza a entrega agora e o template
- Template reescrito com campo estruturado para cada coisa perguntada:
  cadeia do dimensionamento etapa por etapa, margem de contribuicao e ponto
  de equilibrio, tabela dos tres anos separando usuarias ativas de novas,
  priorizacao em essencial, desejavel e opcional com o dado que justifica,
  cinco dimensoes da entrada e campo obrigatorio de premissas
- Auditoria de cobertura: 21 itens perguntados no enunciado, todos com campo
  correspondente, e nenhuma secao sem pergunta
- Criterio E1 da rubrica passa a ser template preenchido por completo
- Margem superior aumentada para o logo nao encostar nos titulos, e linhas de
  resposta com altura de escrita
</commit_message>
<xml_diff>
--- a/ciclo-de-cases/Guia de tipo de case - Market Entry e Novo Produto.docx
+++ b/ciclo-de-cases/Guia de tipo de case - Market Entry e Novo Produto.docx
@@ -1693,7 +1693,7 @@
                 <w:color w:val="1E293B"/>
                 <w:sz w:val="16"/>
               </w:rPr>
-              <w:t>Revisa contra o checklist, confere o limite de páginas e entrega</w:t>
+              <w:t>Revisa contra o checklist, confere se todos os campos do template estão preenchidos e entrega</w:t>
             </w:r>
           </w:p>
         </w:tc>
@@ -1844,7 +1844,7 @@
           <w:color w:val="1E293B"/>
           <w:sz w:val="18"/>
         </w:rPr>
-        <w:t>Está dentro do limite de páginas e no formato pedido.</w:t>
+        <w:t>Está no formato pedido, com todos os campos do template preenchidos.</w:t>
       </w:r>
     </w:p>
     <w:p>

</xml_diff>